<commit_message>
Fix app icon safe zone - full EXP Armada visible on all launchers
</commit_message>
<xml_diff>
--- a/corrections.docx
+++ b/corrections.docx
@@ -79,10 +79,7 @@
         <w:t>On the first Page</w:t>
       </w:r>
       <w:r>
-        <w:t xml:space="preserve"> </w:t>
-      </w:r>
-      <w:r>
-        <w:t>appearing right after the password login.</w:t>
+        <w:t xml:space="preserve"> appearing right after the password login.</w:t>
       </w:r>
     </w:p>
     <w:p>
@@ -467,10 +464,7 @@
     <w:p/>
     <w:p>
       <w:r>
-        <w:t xml:space="preserve">Modification </w:t>
-      </w:r>
-      <w:r>
-        <w:t>2</w:t>
+        <w:t>Modification 2</w:t>
       </w:r>
     </w:p>
     <w:p>
@@ -574,92 +568,194 @@
     <w:p/>
     <w:p/>
     <w:p>
-      <w:r>
-        <w:t xml:space="preserve">Modification </w:t>
-      </w:r>
-      <w:r>
-        <w:t>3</w:t>
-      </w:r>
-    </w:p>
-    <w:p>
-      <w:r>
-        <w:t>In the stock section, while sharing the low stock and out stock report via WhatsApp, the outlet name. the titles LOW STOCK and OUT OF STOCK should be in bold font</w:t>
-      </w:r>
-      <w:r>
-        <w:t xml:space="preserve"> for quick identification</w:t>
-      </w:r>
-      <w:r>
+      <w:pPr>
+        <w:rPr>
+          <w:b/>
+          <w:bCs/>
+          <w:color w:val="00B050"/>
+        </w:rPr>
+      </w:pPr>
+      <w:r>
+        <w:rPr>
+          <w:b/>
+          <w:bCs/>
+          <w:color w:val="00B050"/>
+        </w:rPr>
+        <w:t>Modification 3</w:t>
+      </w:r>
+    </w:p>
+    <w:p>
+      <w:pPr>
+        <w:rPr>
+          <w:b/>
+          <w:bCs/>
+          <w:color w:val="00B050"/>
+        </w:rPr>
+      </w:pPr>
+      <w:r>
+        <w:rPr>
+          <w:b/>
+          <w:bCs/>
+          <w:color w:val="00B050"/>
+        </w:rPr>
+        <w:t>In the stock section, while sharing the low stock and out stock report via WhatsApp, the outlet name. the titles LOW STOCK and OUT OF STOCK should be in bold font for quick identification</w:t>
+      </w:r>
+      <w:r>
+        <w:rPr>
+          <w:b/>
+          <w:bCs/>
+          <w:color w:val="00B050"/>
+        </w:rPr>
         <w:t>.</w:t>
       </w:r>
     </w:p>
     <w:p/>
+    <w:p>
+      <w:pPr>
+        <w:rPr>
+          <w:b/>
+          <w:bCs/>
+          <w:color w:val="00B050"/>
+        </w:rPr>
+      </w:pPr>
+    </w:p>
+    <w:p>
+      <w:pPr>
+        <w:rPr>
+          <w:b/>
+          <w:bCs/>
+          <w:color w:val="00B050"/>
+        </w:rPr>
+      </w:pPr>
+      <w:r>
+        <w:rPr>
+          <w:b/>
+          <w:bCs/>
+          <w:color w:val="00B050"/>
+        </w:rPr>
+        <w:t>Modification 4</w:t>
+      </w:r>
+    </w:p>
+    <w:p>
+      <w:pPr>
+        <w:rPr>
+          <w:b/>
+          <w:bCs/>
+          <w:color w:val="00B050"/>
+        </w:rPr>
+      </w:pPr>
+      <w:r>
+        <w:rPr>
+          <w:b/>
+          <w:bCs/>
+          <w:color w:val="00B050"/>
+        </w:rPr>
+        <w:t xml:space="preserve">Remove the itemList.csv and outlets.csv option currently available in the menu. </w:t>
+      </w:r>
+    </w:p>
     <w:p/>
     <w:p>
-      <w:r>
-        <w:t xml:space="preserve">Modification </w:t>
-      </w:r>
-      <w:r>
-        <w:t>4</w:t>
-      </w:r>
-    </w:p>
-    <w:p>
-      <w:r>
-        <w:t>Remove the itemList.csv and outlets.csv option currently available in the menu</w:t>
-      </w:r>
-      <w:r>
-        <w:t xml:space="preserve">. </w:t>
+      <w:pPr>
+        <w:rPr>
+          <w:b/>
+          <w:bCs/>
+          <w:color w:val="00B050"/>
+        </w:rPr>
+      </w:pPr>
+      <w:r>
+        <w:rPr>
+          <w:b/>
+          <w:bCs/>
+          <w:color w:val="00B050"/>
+        </w:rPr>
+        <w:t>Modification 5</w:t>
+      </w:r>
+    </w:p>
+    <w:p>
+      <w:pPr>
+        <w:rPr>
+          <w:b/>
+          <w:bCs/>
+          <w:color w:val="00B050"/>
+        </w:rPr>
+      </w:pPr>
+      <w:r>
+        <w:rPr>
+          <w:b/>
+          <w:bCs/>
+          <w:color w:val="00B050"/>
+        </w:rPr>
+        <w:t xml:space="preserve">In the stock section, the low stock and out of stock selection section, the number pad and the associated PCS OUT CTN SHARE pad should be down at the bottom of the screen. Currently it is at the top. Also add a C button between CTN and </w:t>
+      </w:r>
+      <w:proofErr w:type="gramStart"/>
+      <w:r>
+        <w:rPr>
+          <w:b/>
+          <w:bCs/>
+          <w:color w:val="00B050"/>
+        </w:rPr>
+        <w:t>SHARE  for</w:t>
+      </w:r>
+      <w:proofErr w:type="gramEnd"/>
+      <w:r>
+        <w:rPr>
+          <w:b/>
+          <w:bCs/>
+          <w:color w:val="00B050"/>
+        </w:rPr>
+        <w:t xml:space="preserve"> clearing the qty in case of wrong entry</w:t>
       </w:r>
     </w:p>
     <w:p/>
     <w:p>
-      <w:r>
-        <w:t xml:space="preserve">Modification </w:t>
-      </w:r>
-      <w:r>
-        <w:t>5</w:t>
-      </w:r>
-    </w:p>
-    <w:p>
-      <w:r>
-        <w:t xml:space="preserve">In the stock section, the low stock and out of stock selection section, the number pad and the associated PCS OUT CTN </w:t>
-      </w:r>
-      <w:r>
-        <w:t xml:space="preserve">SHARE </w:t>
-      </w:r>
-      <w:r>
-        <w:t>pad should be down at the bottom of the screen. Currently it is at the top.</w:t>
-      </w:r>
-      <w:r>
-        <w:t xml:space="preserve"> Also add a C button between CTN and </w:t>
+      <w:pPr>
+        <w:rPr>
+          <w:b/>
+          <w:bCs/>
+          <w:color w:val="00B050"/>
+        </w:rPr>
+      </w:pPr>
+      <w:r>
+        <w:rPr>
+          <w:b/>
+          <w:bCs/>
+          <w:color w:val="00B050"/>
+        </w:rPr>
+        <w:t>Modification 6</w:t>
+      </w:r>
+    </w:p>
+    <w:p>
+      <w:pPr>
+        <w:rPr>
+          <w:b/>
+          <w:bCs/>
+          <w:color w:val="00B050"/>
+        </w:rPr>
+      </w:pPr>
+      <w:r>
+        <w:rPr>
+          <w:b/>
+          <w:bCs/>
+          <w:color w:val="00B050"/>
+        </w:rPr>
+        <w:t xml:space="preserve">In the expiry entry </w:t>
       </w:r>
       <w:proofErr w:type="gramStart"/>
       <w:r>
-        <w:t>SHARE  for</w:t>
+        <w:rPr>
+          <w:b/>
+          <w:bCs/>
+          <w:color w:val="00B050"/>
+        </w:rPr>
+        <w:t>section</w:t>
       </w:r>
       <w:proofErr w:type="gramEnd"/>
       <w:r>
-        <w:t xml:space="preserve"> clearing the qty in case of wrong entry</w:t>
-      </w:r>
-    </w:p>
-    <w:p/>
-    <w:p>
-      <w:r>
-        <w:t xml:space="preserve">Modification </w:t>
-      </w:r>
-      <w:r>
-        <w:t>6</w:t>
-      </w:r>
-    </w:p>
-    <w:p>
-      <w:r>
-        <w:t xml:space="preserve">In the expiry entry </w:t>
-      </w:r>
-      <w:proofErr w:type="gramStart"/>
-      <w:r>
-        <w:t>section</w:t>
-      </w:r>
-      <w:proofErr w:type="gramEnd"/>
-      <w:r>
+        <w:rPr>
+          <w:b/>
+          <w:bCs/>
+          <w:color w:val="00B050"/>
+        </w:rPr>
         <w:t xml:space="preserve"> the moment the quantity is entered the focus quickly goes to barcode field and as a result I cannot enter 2 or more digit quantity and also I cannot choose the PCS OUT CTN option. The focus should shift back to barcode field only after I choose either of the following 3 PCS OUT or CTN. </w:t>
       </w:r>
     </w:p>

</xml_diff>